<commit_message>
SI Fig S4: composite with updated BO trajectories and RMSE surfaces; caption updated
Co-Authored-By: Claude Sonnet 5.5 <noreply@anthropic.com>
Claude-Session: https://claude.ai/code/session_01Y1g9vByMLTE8eGJ9K81zt6
</commit_message>
<xml_diff>
--- a/deliver/Supplementary_tracked.docx
+++ b/deliver/Supplementary_tracked.docx
@@ -20014,53 +20014,118 @@
         <w:spacing w:before="360" w:line="240" w:lineRule="auto"/>
         <w:ind w:firstLine="0"/>
         <w:jc w:val="center"/>
+        <w:rPr>
+          <w:del w:id="20002" w:author="Claude" w:date="2026-10-09T12:01:59Z"/>
+        </w:rPr>
       </w:pPr>
-      <w:r>
-        <w:rPr>
-          <w:noProof/>
-        </w:rPr>
-        <w:drawing>
-          <wp:inline distT="0" distB="0" distL="0" distR="0" wp14:anchorId="4D4D8C5A" wp14:editId="330E3F0C">
-            <wp:extent cx="5731510" cy="3407382"/>
-            <wp:effectExtent l="0" t="0" r="2540" b="2540"/>
-            <wp:docPr id="3" name="Picture 3"/>
-            <wp:cNvGraphicFramePr>
-              <a:graphicFrameLocks xmlns:a="http://schemas.openxmlformats.org/drawingml/2006/main" noChangeAspect="1"/>
-            </wp:cNvGraphicFramePr>
-            <a:graphic xmlns:a="http://schemas.openxmlformats.org/drawingml/2006/main">
-              <a:graphicData uri="http://schemas.openxmlformats.org/drawingml/2006/picture">
-                <pic:pic xmlns:pic="http://schemas.openxmlformats.org/drawingml/2006/picture">
-                  <pic:nvPicPr>
-                    <pic:cNvPr id="3" name="Picture 3"/>
-                    <pic:cNvPicPr/>
-                  </pic:nvPicPr>
-                  <pic:blipFill>
-                    <a:blip r:embed="rId11" cstate="print">
-                      <a:extLst>
-                        <a:ext uri="{28A0092B-C50C-407E-A947-70E740481C1C}">
-                          <a14:useLocalDpi xmlns:a14="http://schemas.microsoft.com/office/drawing/2010/main" val="0"/>
-                        </a:ext>
-                      </a:extLst>
-                    </a:blip>
-                    <a:stretch>
-                      <a:fillRect/>
-                    </a:stretch>
-                  </pic:blipFill>
-                  <pic:spPr>
-                    <a:xfrm>
-                      <a:off x="0" y="0"/>
-                      <a:ext cx="5731510" cy="3407382"/>
-                    </a:xfrm>
-                    <a:prstGeom prst="rect">
-                      <a:avLst/>
-                    </a:prstGeom>
-                  </pic:spPr>
-                </pic:pic>
-              </a:graphicData>
-            </a:graphic>
-          </wp:inline>
-        </w:drawing>
-      </w:r>
+      <w:del w:id="20001" w:author="Claude" w:date="2026-10-09T12:01:59Z">
+        <w:r>
+          <w:rPr>
+            <w:noProof/>
+          </w:rPr>
+          <w:drawing>
+            <wp:inline distT="0" distB="0" distL="0" distR="0" wp14:anchorId="4D4D8C5A" wp14:editId="330E3F0C">
+              <wp:extent cx="5731510" cy="3407382"/>
+              <wp:effectExtent l="0" t="0" r="2540" b="2540"/>
+              <wp:docPr id="3" name="Picture 3"/>
+              <wp:cNvGraphicFramePr>
+                <a:graphicFrameLocks xmlns:a="http://schemas.openxmlformats.org/drawingml/2006/main" noChangeAspect="1"/>
+              </wp:cNvGraphicFramePr>
+              <a:graphic xmlns:a="http://schemas.openxmlformats.org/drawingml/2006/main">
+                <a:graphicData uri="http://schemas.openxmlformats.org/drawingml/2006/picture">
+                  <pic:pic xmlns:pic="http://schemas.openxmlformats.org/drawingml/2006/picture">
+                    <pic:nvPicPr>
+                      <pic:cNvPr id="3" name="Picture 3"/>
+                      <pic:cNvPicPr/>
+                    </pic:nvPicPr>
+                    <pic:blipFill>
+                      <a:blip r:embed="rId11" cstate="print">
+                        <a:extLst>
+                          <a:ext uri="{28A0092B-C50C-407E-A947-70E740481C1C}">
+                            <a14:useLocalDpi xmlns:a14="http://schemas.microsoft.com/office/drawing/2010/main" val="0"/>
+                          </a:ext>
+                        </a:extLst>
+                      </a:blip>
+                      <a:stretch>
+                        <a:fillRect/>
+                      </a:stretch>
+                    </pic:blipFill>
+                    <pic:spPr>
+                      <a:xfrm>
+                        <a:off x="0" y="0"/>
+                        <a:ext cx="5731510" cy="3407382"/>
+                      </a:xfrm>
+                      <a:prstGeom prst="rect">
+                        <a:avLst/>
+                      </a:prstGeom>
+                    </pic:spPr>
+                  </pic:pic>
+                </a:graphicData>
+              </a:graphic>
+            </wp:inline>
+          </w:drawing>
+        </w:r>
+      </w:del>
+    </w:p>
+    <w:p>
+      <w:pPr>
+        <w:pStyle w:val="BodyText"/>
+        <w:keepNext/>
+        <w:spacing w:before="360" w:line="240" w:lineRule="auto"/>
+        <w:ind w:firstLine="0"/>
+        <w:jc w:val="center"/>
+        <w:rPr>
+          <w:ins w:id="20004" w:author="Claude" w:date="2026-10-09T12:01:59Z"/>
+        </w:rPr>
+      </w:pPr>
+      <w:ins w:id="20003" w:author="Claude" w:date="2026-10-09T12:01:59Z">
+        <w:r>
+          <w:rPr>
+            <w:noProof/>
+          </w:rPr>
+          <w:drawing>
+            <wp:inline distT="0" distB="0" distL="0" distR="0" wp14:anchorId="4D4D8C5A" wp14:editId="330E3F0C">
+              <wp:extent cx="5731510" cy="3721660"/>
+              <wp:effectExtent l="0" t="0" r="2540" b="2540"/>
+              <wp:docPr id="901" name="Picture 3"/>
+              <wp:cNvGraphicFramePr>
+                <a:graphicFrameLocks xmlns:a="http://schemas.openxmlformats.org/drawingml/2006/main" noChangeAspect="1"/>
+              </wp:cNvGraphicFramePr>
+              <a:graphic xmlns:a="http://schemas.openxmlformats.org/drawingml/2006/main">
+                <a:graphicData uri="http://schemas.openxmlformats.org/drawingml/2006/picture">
+                  <pic:pic xmlns:pic="http://schemas.openxmlformats.org/drawingml/2006/picture">
+                    <pic:nvPicPr>
+                      <pic:cNvPr id="902" name="Picture 3"/>
+                      <pic:cNvPicPr/>
+                    </pic:nvPicPr>
+                    <pic:blipFill>
+                      <a:blip r:embed="rId19" cstate="print">
+                        <a:extLst>
+                          <a:ext uri="{28A0092B-C50C-407E-A947-70E740481C1C}">
+                            <a14:useLocalDpi xmlns:a14="http://schemas.microsoft.com/office/drawing/2010/main" val="0"/>
+                          </a:ext>
+                        </a:extLst>
+                      </a:blip>
+                      <a:stretch>
+                        <a:fillRect/>
+                      </a:stretch>
+                    </pic:blipFill>
+                    <pic:spPr>
+                      <a:xfrm>
+                        <a:off x="0" y="0"/>
+                        <a:ext cx="5731510" cy="3721660"/>
+                      </a:xfrm>
+                      <a:prstGeom prst="rect">
+                        <a:avLst/>
+                      </a:prstGeom>
+                    </pic:spPr>
+                  </pic:pic>
+                </a:graphicData>
+              </a:graphic>
+            </wp:inline>
+          </w:drawing>
+        </w:r>
+      </w:ins>
     </w:p>
     <w:p>
       <w:pPr>
@@ -20167,7 +20232,39 @@
           <w:sz w:val="20"/>
           <w:szCs w:val="20"/>
         </w:rPr>
-        <w:t>Bayesian calibration results: (a) simulated and literature mass loss, (b) normalized parameter trajectories, and (c–e) RMSE response surfaces for pairwise combinations of</w:t>
+        <w:t xml:space="preserve">Bayesian calibration results: (a) simulated and literature mass loss, (b) normalized </w:t>
+      </w:r>
+      <w:ins w:id="9004" w:author="Claude" w:date="2026-10-09T12:01:59Z">
+        <w:r>
+          <w:rPr>
+            <w:sz w:val="20"/>
+            <w:szCs w:val="20"/>
+          </w:rPr>
+          <w:t xml:space="preserve">log10 </w:t>
+        </w:r>
+      </w:ins>
+      <w:r>
+        <w:rPr>
+          <w:sz w:val="20"/>
+          <w:szCs w:val="20"/>
+        </w:rPr>
+        <w:t xml:space="preserve">parameter trajectories</w:t>
+      </w:r>
+      <w:ins w:id="9003" w:author="Claude" w:date="2026-10-09T12:01:59Z">
+        <w:r>
+          <w:rPr>
+            <w:sz w:val="20"/>
+            <w:szCs w:val="20"/>
+          </w:rPr>
+          <w:t xml:space="preserve"> over the 32 evaluations (optimum at iteration 22)</w:t>
+        </w:r>
+      </w:ins>
+      <w:r>
+        <w:rPr>
+          <w:sz w:val="20"/>
+          <w:szCs w:val="20"/>
+        </w:rPr>
+        <w:t xml:space="preserve">, and (c–e) RMSE response surfaces for pairwise combinations of</w:t>
       </w:r>
       <w:r>
         <w:rPr>
@@ -20244,8 +20341,36 @@
           <w:sz w:val="20"/>
           <w:szCs w:val="20"/>
         </w:rPr>
-        <w:t xml:space="preserve">, and </w:t>
-      </w:r>
+        <w:t xml:space="preserve">, and</w:t>
+      </w:r>
+      <w:ins w:id="9002" w:author="Claude" w:date="2026-10-09T12:01:59Z">
+        <w:r>
+          <w:rPr>
+            <w:rFonts w:cs="Times New Roman"/>
+            <w:sz w:val="20"/>
+            <w:szCs w:val="20"/>
+          </w:rPr>
+          <w:t xml:space="preserve">  (log</w:t>
+        </w:r>
+      </w:ins>
+      <w:r>
+        <w:rPr>
+          <w:rFonts w:cs="Times New Roman"/>
+          <w:sz w:val="20"/>
+          <w:szCs w:val="20"/>
+        </w:rPr>
+        <w:t xml:space="preserve"> </w:t>
+      </w:r>
+      <w:ins w:id="9001" w:author="Claude" w:date="2026-10-09T12:01:59Z">
+        <w:r>
+          <w:rPr>
+            <w:rFonts w:cs="Times New Roman"/>
+            <w:sz w:val="20"/>
+            <w:szCs w:val="20"/>
+          </w:rPr>
+          <w:t xml:space="preserve">axes; smoothed interpolants of the evaluations with kORR ≤ 200 mm h-1, shown only near evaluated points; black dots, evaluated parameter sets; star, optimum)</w:t>
+        </w:r>
+      </w:ins>
       <m:oMath>
         <m:sSub>
           <m:sSubPr>

</xml_diff>

<commit_message>
SI S8: mesh-correction figure (L2 vs L6) and text
Co-Authored-By: Claude Sonnet 5.5 <noreply@anthropic.com>
Claude-Session: https://claude.ai/code/session_01Y1g9vByMLTE8eGJ9K81zt6
</commit_message>
<xml_diff>
--- a/deliver/Supplementary_tracked.docx
+++ b/deliver/Supplementary_tracked.docx
@@ -27122,6 +27122,195 @@
       <w:ins w:id="245" w:author="Claude" w:date="2026-10-09T01:36:00Z">
         <w:r>
           <w:t>[Table S15. Mesh correction: coarse vs fine mesh mass-loss pairs and the correction constants, to be inserted.]</w:t>
+        </w:r>
+      </w:ins>
+    </w:p>
+    <w:p>
+      <w:pPr>
+        <w:pStyle w:val="BodyText"/>
+        <w:spacing w:after="120"/>
+        <w:ind w:firstLine="0"/>
+        <w:rPr>
+          <w:ins w:id="20002" w:author="Claude" w:date="2026-10-09T13:53:10Z"/>
+        </w:rPr>
+      </w:pPr>
+      <w:ins w:id="20001" w:author="Claude" w:date="2026-10-09T13:53:10Z">
+        <w:r>
+          <w:t xml:space="preserve">The coarse-mesh (L2) calibration simulations are related to the fine-mesh (L6) result by a single proportionality factor over 672 h, L2 = 1.355846 × L6 (r = 0.9986; Figure S9). The coarse-mesh mass-loss curves were divided by this factor.</w:t>
+        </w:r>
+      </w:ins>
+    </w:p>
+    <w:p>
+      <w:pPr>
+        <w:keepNext/>
+        <w:spacing w:before="360" w:line="240" w:lineRule="auto"/>
+        <w:ind w:firstLine="0"/>
+        <w:jc w:val="center"/>
+        <w:rPr>
+          <w:ins w:id="20004" w:author="Claude" w:date="2026-10-09T13:53:10Z"/>
+          <w:iCs/>
+          <w:sz w:val="22"/>
+          <w:szCs w:val="22"/>
+        </w:rPr>
+      </w:pPr>
+      <w:ins w:id="20003" w:author="Claude" w:date="2026-10-09T13:53:10Z">
+        <w:r>
+          <w:rPr>
+            <w:noProof/>
+          </w:rPr>
+          <w:lastRenderedPageBreak/>
+          <w:drawing>
+            <wp:inline distT="0" distB="0" distL="0" distR="0" wp14:anchorId="186C67CE" wp14:editId="11D70CD3">
+              <wp:extent cx="5731510" cy="2352784"/>
+              <wp:effectExtent l="0" t="0" r="2540" b="0"/>
+              <wp:docPr id="911" name="Picture 10"/>
+              <wp:cNvGraphicFramePr>
+                <a:graphicFrameLocks xmlns:a="http://schemas.openxmlformats.org/drawingml/2006/main" noChangeAspect="1"/>
+              </wp:cNvGraphicFramePr>
+              <a:graphic xmlns:a="http://schemas.openxmlformats.org/drawingml/2006/main">
+                <a:graphicData uri="http://schemas.openxmlformats.org/drawingml/2006/picture">
+                  <pic:pic xmlns:pic="http://schemas.openxmlformats.org/drawingml/2006/picture">
+                    <pic:nvPicPr>
+                      <pic:cNvPr id="912" name="Picture 10"/>
+                      <pic:cNvPicPr>
+                        <a:picLocks noChangeAspect="1" noChangeArrowheads="1"/>
+                      </pic:cNvPicPr>
+                    </pic:nvPicPr>
+                    <pic:blipFill>
+                      <a:blip r:embed="rId20" cstate="print">
+                        <a:extLst>
+                          <a:ext uri="{28A0092B-C50C-407E-A947-70E740481C1C}">
+                            <a14:useLocalDpi xmlns:a14="http://schemas.microsoft.com/office/drawing/2010/main" val="0"/>
+                          </a:ext>
+                        </a:extLst>
+                      </a:blip>
+                      <a:srcRect/>
+                      <a:stretch>
+                        <a:fillRect/>
+                      </a:stretch>
+                    </pic:blipFill>
+                    <pic:spPr bwMode="auto">
+                      <a:xfrm>
+                        <a:off x="0" y="0"/>
+                        <a:ext cx="5731510" cy="2352784"/>
+                      </a:xfrm>
+                      <a:prstGeom prst="rect">
+                        <a:avLst/>
+                      </a:prstGeom>
+                      <a:noFill/>
+                      <a:ln>
+                        <a:noFill/>
+                      </a:ln>
+                    </pic:spPr>
+                  </pic:pic>
+                </a:graphicData>
+              </a:graphic>
+            </wp:inline>
+          </w:drawing>
+        </w:r>
+      </w:ins>
+    </w:p>
+    <w:p>
+      <w:pPr>
+        <w:pStyle w:val="Captions"/>
+        <w:spacing w:before="80" w:after="360"/>
+        <w:rPr>
+          <w:ins w:id="20014" w:author="Claude" w:date="2026-10-09T13:53:10Z"/>
+        </w:rPr>
+      </w:pPr>
+      <w:ins w:id="20005" w:author="Claude" w:date="2026-10-09T13:53:10Z">
+        <w:r>
+          <w:rPr>
+            <w:b/>
+            <w:bCs/>
+            <w:sz w:val="20"/>
+            <w:szCs w:val="20"/>
+          </w:rPr>
+          <w:t xml:space="preserve">Figure S</w:t>
+        </w:r>
+      </w:ins>
+      <w:ins w:id="20006" w:author="Claude" w:date="2026-10-09T13:53:10Z">
+        <w:r>
+          <w:rPr>
+            <w:b/>
+            <w:bCs/>
+            <w:sz w:val="20"/>
+            <w:szCs w:val="20"/>
+          </w:rPr>
+          <w:fldChar w:fldCharType="begin"/>
+        </w:r>
+      </w:ins>
+      <w:ins w:id="20007" w:author="Claude" w:date="2026-10-09T13:53:10Z">
+        <w:r>
+          <w:rPr>
+            <w:b/>
+            <w:bCs/>
+            <w:sz w:val="20"/>
+            <w:szCs w:val="20"/>
+          </w:rPr>
+          <w:instrText xml:space="preserve"> SEQ Figure \* ARABIC </w:instrText>
+        </w:r>
+      </w:ins>
+      <w:ins w:id="20008" w:author="Claude" w:date="2026-10-09T13:53:10Z">
+        <w:r>
+          <w:rPr>
+            <w:b/>
+            <w:bCs/>
+            <w:sz w:val="20"/>
+            <w:szCs w:val="20"/>
+          </w:rPr>
+          <w:fldChar w:fldCharType="separate"/>
+        </w:r>
+      </w:ins>
+      <w:ins w:id="20009" w:author="Claude" w:date="2026-10-09T13:53:10Z">
+        <w:r>
+          <w:rPr>
+            <w:b/>
+            <w:bCs/>
+            <w:sz w:val="20"/>
+            <w:szCs w:val="20"/>
+          </w:rPr>
+          <w:t xml:space="preserve">9</w:t>
+        </w:r>
+      </w:ins>
+      <w:ins w:id="20010" w:author="Claude" w:date="2026-10-09T13:53:10Z">
+        <w:r>
+          <w:rPr>
+            <w:b/>
+            <w:bCs/>
+            <w:sz w:val="20"/>
+            <w:szCs w:val="20"/>
+          </w:rPr>
+          <w:fldChar w:fldCharType="end"/>
+        </w:r>
+      </w:ins>
+      <w:ins w:id="20011" w:author="Claude" w:date="2026-10-09T13:53:10Z">
+        <w:r>
+          <w:rPr>
+            <w:b/>
+            <w:bCs/>
+            <w:sz w:val="20"/>
+            <w:szCs w:val="20"/>
+          </w:rPr>
+          <w:t xml:space="preserve">.</w:t>
+        </w:r>
+      </w:ins>
+      <w:ins w:id="20012" w:author="Claude" w:date="2026-10-09T13:53:10Z">
+        <w:r>
+          <w:rPr>
+            <w:sz w:val="20"/>
+            <w:szCs w:val="20"/>
+          </w:rPr>
+          <w:t xml:space="preserve"> </w:t>
+        </w:r>
+      </w:ins>
+      <w:ins w:id="20013" w:author="Claude" w:date="2026-10-09T13:53:10Z">
+        <w:r>
+          <w:rPr>
+            <w:sz w:val="20"/>
+            <w:szCs w:val="20"/>
+          </w:rPr>
+          <w:t xml:space="preserve">Mesh correction between the coarse (L2, low) and fine (L6, ultra-high) meshes. Left: mass loss versus time for the two meshes. Right: L2 versus L6 mass loss at matching times (r = 0.9986); the line through the origin is L2 = 1.355846 × L6, and the dashed line is 1:1.</w:t>
         </w:r>
       </w:ins>
     </w:p>

</xml_diff>

<commit_message>
SI S9: computational domain and oxygen supply (Figure S10)
Co-Authored-By: Claude Sonnet 5.5 <noreply@anthropic.com>
Claude-Session: https://claude.ai/code/session_01Y1g9vByMLTE8eGJ9K81zt6
</commit_message>
<xml_diff>
--- a/deliver/Supplementary_tracked.docx
+++ b/deliver/Supplementary_tracked.docx
@@ -27311,6 +27311,211 @@
             <w:szCs w:val="20"/>
           </w:rPr>
           <w:t xml:space="preserve">Mesh correction between the coarse (L2, low) and fine (L6, ultra-high) meshes. Left: mass loss versus time for the two meshes. Right: L2 versus L6 mass loss at matching times (r = 0.9986); the line through the origin is L2 = 1.355846 × L6, and the dashed line is 1:1.</w:t>
+        </w:r>
+      </w:ins>
+    </w:p>
+    <w:p>
+      <w:pPr>
+        <w:pStyle w:val="Heading1"/>
+        <w:rPr>
+          <w:ins w:id="20002" w:author="Claude" w:date="2026-10-09T14:13:22Z"/>
+          <w:ins w:id="171" w:author="Claude" w:date="2026-10-09T01:36:00Z"/>
+        </w:rPr>
+      </w:pPr>
+      <w:ins w:id="20001" w:author="Claude" w:date="2026-10-09T14:13:22Z">
+        <w:r>
+          <w:t xml:space="preserve">S9. Computational domain and oxygen supply</w:t>
+        </w:r>
+      </w:ins>
+    </w:p>
+    <w:p>
+      <w:pPr>
+        <w:pStyle w:val="BodyText"/>
+        <w:spacing w:after="120"/>
+        <w:ind w:firstLine="0"/>
+        <w:rPr>
+          <w:ins w:id="20004" w:author="Claude" w:date="2026-10-09T14:13:22Z"/>
+        </w:rPr>
+      </w:pPr>
+      <w:ins w:id="20003" w:author="Claude" w:date="2026-10-09T14:13:22Z">
+        <w:r>
+          <w:t xml:space="preserve">The computational electrolyte domain (30 × 30 × 30 mm, 27 mL) is smaller than the experimental immersion volume (44 mL), so the oxygen reservoir available in the simulation is smaller than in the experiment. To show how the prediction depends on oxygen availability, the disc simulation was run with oxygen replenished through different faces of the domain (Figure S10a) and with different initial dissolved-oxygen concentrations (Figure S10b). With no oxygen-replenishing boundary, mass loss levelled off at approximately 0.055% within about 100 h, as the oxygen initially present in the finite domain was consumed. Replenishing oxygen through the top and bottom faces gave the same mass loss as replenishing it through all faces (approximately 0.43% at 672 h), and replenishing through the side faces alone gave approximately 0.40%, so the prediction is governed by the oxygen supplied through the boundary rather than by the domain volume itself. Predicted mass loss at 672 h increased from approximately 0.16% to 0.81% as the initial oxygen concentration was increased from 1.5 × 10⁻⁹ to 7.5 × 10⁻⁹ g mm⁻³ (Figure S10b), consistent with oxygen availability controlling the degradation rate.</w:t>
+        </w:r>
+      </w:ins>
+    </w:p>
+    <w:p>
+      <w:pPr>
+        <w:keepNext/>
+        <w:spacing w:before="360" w:line="240" w:lineRule="auto"/>
+        <w:ind w:firstLine="0"/>
+        <w:jc w:val="center"/>
+        <w:rPr>
+          <w:ins w:id="20006" w:author="Claude" w:date="2026-10-09T14:13:22Z"/>
+          <w:ins w:id="20004" w:author="Claude" w:date="2026-10-09T13:53:10Z"/>
+          <w:iCs/>
+          <w:sz w:val="22"/>
+          <w:szCs w:val="22"/>
+        </w:rPr>
+      </w:pPr>
+      <w:ins w:id="20005" w:author="Claude" w:date="2026-10-09T14:13:22Z">
+        <w:r>
+          <w:rPr>
+            <w:noProof/>
+          </w:rPr>
+          <w:lastRenderedPageBreak/>
+          <w:drawing>
+            <wp:inline distT="0" distB="0" distL="0" distR="0" wp14:anchorId="186C67CE" wp14:editId="11D70CD3">
+              <wp:extent cx="5731510" cy="2093921"/>
+              <wp:effectExtent l="0" t="0" r="2540" b="0"/>
+              <wp:docPr id="921" name="Picture 10"/>
+              <wp:cNvGraphicFramePr>
+                <a:graphicFrameLocks xmlns:a="http://schemas.openxmlformats.org/drawingml/2006/main" noChangeAspect="1"/>
+              </wp:cNvGraphicFramePr>
+              <a:graphic xmlns:a="http://schemas.openxmlformats.org/drawingml/2006/main">
+                <a:graphicData uri="http://schemas.openxmlformats.org/drawingml/2006/picture">
+                  <pic:pic xmlns:pic="http://schemas.openxmlformats.org/drawingml/2006/picture">
+                    <pic:nvPicPr>
+                      <pic:cNvPr id="922" name="Picture 10"/>
+                      <pic:cNvPicPr>
+                        <a:picLocks noChangeAspect="1" noChangeArrowheads="1"/>
+                      </pic:cNvPicPr>
+                    </pic:nvPicPr>
+                    <pic:blipFill>
+                      <a:blip r:embed="rId21" cstate="print">
+                        <a:extLst>
+                          <a:ext uri="{28A0092B-C50C-407E-A947-70E740481C1C}">
+                            <a14:useLocalDpi xmlns:a14="http://schemas.microsoft.com/office/drawing/2010/main" val="0"/>
+                          </a:ext>
+                        </a:extLst>
+                      </a:blip>
+                      <a:srcRect/>
+                      <a:stretch>
+                        <a:fillRect/>
+                      </a:stretch>
+                    </pic:blipFill>
+                    <pic:spPr bwMode="auto">
+                      <a:xfrm>
+                        <a:off x="0" y="0"/>
+                        <a:ext cx="5731510" cy="2093921"/>
+                      </a:xfrm>
+                      <a:prstGeom prst="rect">
+                        <a:avLst/>
+                      </a:prstGeom>
+                      <a:noFill/>
+                      <a:ln>
+                        <a:noFill/>
+                      </a:ln>
+                    </pic:spPr>
+                  </pic:pic>
+                </a:graphicData>
+              </a:graphic>
+            </wp:inline>
+          </w:drawing>
+        </w:r>
+      </w:ins>
+    </w:p>
+    <w:p>
+      <w:pPr>
+        <w:pStyle w:val="Captions"/>
+        <w:spacing w:before="80" w:after="360"/>
+        <w:rPr>
+          <w:ins w:id="20016" w:author="Claude" w:date="2026-10-09T14:13:22Z"/>
+          <w:ins w:id="20014" w:author="Claude" w:date="2026-10-09T13:53:10Z"/>
+        </w:rPr>
+      </w:pPr>
+      <w:ins w:id="20007" w:author="Claude" w:date="2026-10-09T14:13:22Z">
+        <w:r>
+          <w:rPr>
+            <w:b/>
+            <w:bCs/>
+            <w:sz w:val="20"/>
+            <w:szCs w:val="20"/>
+          </w:rPr>
+          <w:t xml:space="preserve">Figure S</w:t>
+        </w:r>
+      </w:ins>
+      <w:ins w:id="20008" w:author="Claude" w:date="2026-10-09T14:13:22Z">
+        <w:r>
+          <w:rPr>
+            <w:b/>
+            <w:bCs/>
+            <w:sz w:val="20"/>
+            <w:szCs w:val="20"/>
+          </w:rPr>
+          <w:fldChar w:fldCharType="begin"/>
+        </w:r>
+      </w:ins>
+      <w:ins w:id="20009" w:author="Claude" w:date="2026-10-09T14:13:22Z">
+        <w:r>
+          <w:rPr>
+            <w:b/>
+            <w:bCs/>
+            <w:sz w:val="20"/>
+            <w:szCs w:val="20"/>
+          </w:rPr>
+          <w:instrText xml:space="preserve"> SEQ Figure \* ARABIC </w:instrText>
+        </w:r>
+      </w:ins>
+      <w:ins w:id="20010" w:author="Claude" w:date="2026-10-09T14:13:22Z">
+        <w:r>
+          <w:rPr>
+            <w:b/>
+            <w:bCs/>
+            <w:sz w:val="20"/>
+            <w:szCs w:val="20"/>
+          </w:rPr>
+          <w:fldChar w:fldCharType="separate"/>
+        </w:r>
+      </w:ins>
+      <w:ins w:id="20011" w:author="Claude" w:date="2026-10-09T14:13:22Z">
+        <w:r>
+          <w:rPr>
+            <w:b/>
+            <w:bCs/>
+            <w:sz w:val="20"/>
+            <w:szCs w:val="20"/>
+          </w:rPr>
+          <w:t xml:space="preserve">10</w:t>
+        </w:r>
+      </w:ins>
+      <w:ins w:id="20012" w:author="Claude" w:date="2026-10-09T14:13:22Z">
+        <w:r>
+          <w:rPr>
+            <w:b/>
+            <w:bCs/>
+            <w:sz w:val="20"/>
+            <w:szCs w:val="20"/>
+          </w:rPr>
+          <w:fldChar w:fldCharType="end"/>
+        </w:r>
+      </w:ins>
+      <w:ins w:id="20013" w:author="Claude" w:date="2026-10-09T14:13:22Z">
+        <w:r>
+          <w:rPr>
+            <w:b/>
+            <w:bCs/>
+            <w:sz w:val="20"/>
+            <w:szCs w:val="20"/>
+          </w:rPr>
+          <w:t xml:space="preserve">.</w:t>
+        </w:r>
+      </w:ins>
+      <w:ins w:id="20014" w:author="Claude" w:date="2026-10-09T14:13:22Z">
+        <w:r>
+          <w:rPr>
+            <w:sz w:val="20"/>
+            <w:szCs w:val="20"/>
+          </w:rPr>
+          <w:t xml:space="preserve"> </w:t>
+        </w:r>
+      </w:ins>
+      <w:ins w:id="20015" w:author="Claude" w:date="2026-10-09T14:13:22Z">
+        <w:r>
+          <w:rPr>
+            <w:sz w:val="20"/>
+            <w:szCs w:val="20"/>
+          </w:rPr>
+          <w:t xml:space="preserve">Effect of oxygen supply on predicted mass loss. (a) Mass loss for the disc with no oxygen-replenishing boundary (None), replenishment through the top and bottom faces, the side faces, or all faces; the inset shows the boundaries replenished in each case. (b) Mass loss for initial dissolved-oxygen concentrations of 1.5, 3.5, 5.5 and 7.5 × 10⁻⁹ g mm⁻³.</w:t>
         </w:r>
       </w:ins>
     </w:p>

</xml_diff>

<commit_message>
SI S1: concise interfacial balance and units paragraph
</commit_message>
<xml_diff>
--- a/deliver/Supplementary_tracked.docx
+++ b/deliver/Supplementary_tracked.docx
@@ -3553,6 +3553,164 @@
         </w:tc>
       </w:tr>
     </w:tbl>
+    <w:p>
+      <w:pPr>
+        <w:pStyle w:val="BodyText"/>
+        <w:spacing w:after="120"/>
+        <w:ind w:firstLine="0"/>
+        <w:rPr>
+          <w:ins w:id="20024" w:author="Claude" w:date="2026-10-09T22:36:37Z"/>
+        </w:rPr>
+      </w:pPr>
+      <w:ins w:id="20001" w:author="Claude" w:date="2026-10-09T22:36:37Z">
+        <w:r>
+          <w:t xml:space="preserve">Interfacial balance and units. The interface couples O₂ consumption, Zn²⁺ release, OH⁻ generation and metal loss through the reaction above: for each mole of O₂ consumed by the Robin sink, two moles of Zn leave the metal and 2 mol Zn²⁺ and 4 mol OH⁻ are released, so the Zn source in the Zn equation equals ρ</w:t>
+        </w:r>
+      </w:ins>
+      <w:ins w:id="20002" w:author="Claude" w:date="2026-10-09T22:36:37Z">
+        <w:r>
+          <w:rPr>
+            <w:vertAlign w:val="subscript"/>
+          </w:rPr>
+          <w:t xml:space="preserve">Zn</w:t>
+        </w:r>
+      </w:ins>
+      <w:ins w:id="20003" w:author="Claude" w:date="2026-10-09T22:36:37Z">
+        <w:r>
+          <w:t xml:space="preserve">|v</w:t>
+        </w:r>
+      </w:ins>
+      <w:ins w:id="20004" w:author="Claude" w:date="2026-10-09T22:36:37Z">
+        <w:r>
+          <w:rPr>
+            <w:vertAlign w:val="subscript"/>
+          </w:rPr>
+          <w:t xml:space="preserve">n</w:t>
+        </w:r>
+      </w:ins>
+      <w:ins w:id="20005" w:author="Claude" w:date="2026-10-09T22:36:37Z">
+        <w:r>
+          <w:t xml:space="preserve">|. In the code, species fields are mass-based (g mm⁻³; OH⁻ in mol L⁻¹), with k</w:t>
+        </w:r>
+      </w:ins>
+      <w:ins w:id="20006" w:author="Claude" w:date="2026-10-09T22:36:37Z">
+        <w:r>
+          <w:rPr>
+            <w:vertAlign w:val="subscript"/>
+          </w:rPr>
+          <w:t xml:space="preserve">ORR</w:t>
+        </w:r>
+      </w:ins>
+      <w:ins w:id="20007" w:author="Claude" w:date="2026-10-09T22:36:37Z">
+        <w:r>
+          <w:t xml:space="preserve"> in mm h⁻¹, k</w:t>
+        </w:r>
+      </w:ins>
+      <w:ins w:id="20008" w:author="Claude" w:date="2026-10-09T22:36:37Z">
+        <w:r>
+          <w:rPr>
+            <w:vertAlign w:val="subscript"/>
+          </w:rPr>
+          <w:t xml:space="preserve">f</w:t>
+        </w:r>
+      </w:ins>
+      <w:ins w:id="20009" w:author="Claude" w:date="2026-10-09T22:36:37Z">
+        <w:r>
+          <w:t xml:space="preserve"> in h⁻¹, diffusivities in mm² h⁻¹ and k</w:t>
+        </w:r>
+      </w:ins>
+      <w:ins w:id="20010" w:author="Claude" w:date="2026-10-09T22:36:37Z">
+        <w:r>
+          <w:rPr>
+            <w:vertAlign w:val="subscript"/>
+          </w:rPr>
+          <w:t xml:space="preserve">d</w:t>
+        </w:r>
+      </w:ins>
+      <w:ins w:id="20011" w:author="Claude" w:date="2026-10-09T22:36:37Z">
+        <w:r>
+          <w:t xml:space="preserve"> in mm⁶ g⁻² h⁻¹; the molar k</w:t>
+        </w:r>
+      </w:ins>
+      <w:ins w:id="20012" w:author="Claude" w:date="2026-10-09T22:36:37Z">
+        <w:r>
+          <w:rPr>
+            <w:vertAlign w:val="subscript"/>
+          </w:rPr>
+          <w:t xml:space="preserve">d</w:t>
+        </w:r>
+      </w:ins>
+      <w:ins w:id="20013" w:author="Claude" w:date="2026-10-09T22:36:37Z">
+        <w:r>
+          <w:t xml:space="preserve"> of the Cl⁻ term (L² mol⁻² h⁻¹) equals k</w:t>
+        </w:r>
+      </w:ins>
+      <w:ins w:id="20014" w:author="Claude" w:date="2026-10-09T22:36:37Z">
+        <w:r>
+          <w:rPr>
+            <w:vertAlign w:val="subscript"/>
+          </w:rPr>
+          <w:t xml:space="preserve">d</w:t>
+        </w:r>
+      </w:ins>
+      <w:ins w:id="20015" w:author="Claude" w:date="2026-10-09T22:36:37Z">
+        <w:r>
+          <w:t xml:space="preserve"> (mm⁶ g⁻² h⁻¹) divided by (10⁶/M</w:t>
+        </w:r>
+      </w:ins>
+      <w:ins w:id="20016" w:author="Claude" w:date="2026-10-09T22:36:37Z">
+        <w:r>
+          <w:rPr>
+            <w:vertAlign w:val="subscript"/>
+          </w:rPr>
+          <w:t xml:space="preserve">Cl</w:t>
+        </w:r>
+      </w:ins>
+      <w:ins w:id="20017" w:author="Claude" w:date="2026-10-09T22:36:37Z">
+        <w:r>
+          <w:t xml:space="preserve">)² ≈ 8.0 × 10⁸. Concentrations in figures are given in mg L⁻¹; mmol L⁻¹ = (mg L⁻¹)/M, with M</w:t>
+        </w:r>
+      </w:ins>
+      <w:ins w:id="20018" w:author="Claude" w:date="2026-10-09T22:36:37Z">
+        <w:r>
+          <w:rPr>
+            <w:vertAlign w:val="subscript"/>
+          </w:rPr>
+          <w:t xml:space="preserve">Zn</w:t>
+        </w:r>
+      </w:ins>
+      <w:ins w:id="20019" w:author="Claude" w:date="2026-10-09T22:36:37Z">
+        <w:r>
+          <w:t xml:space="preserve"> = 65.38, M</w:t>
+        </w:r>
+      </w:ins>
+      <w:ins w:id="20020" w:author="Claude" w:date="2026-10-09T22:36:37Z">
+        <w:r>
+          <w:rPr>
+            <w:vertAlign w:val="subscript"/>
+          </w:rPr>
+          <w:t xml:space="preserve">O2</w:t>
+        </w:r>
+      </w:ins>
+      <w:ins w:id="20021" w:author="Claude" w:date="2026-10-09T22:36:37Z">
+        <w:r>
+          <w:t xml:space="preserve"> = 32.00 and M</w:t>
+        </w:r>
+      </w:ins>
+      <w:ins w:id="20022" w:author="Claude" w:date="2026-10-09T22:36:37Z">
+        <w:r>
+          <w:rPr>
+            <w:vertAlign w:val="subscript"/>
+          </w:rPr>
+          <w:t xml:space="preserve">Cl</w:t>
+        </w:r>
+      </w:ins>
+      <w:ins w:id="20023" w:author="Claude" w:date="2026-10-09T22:36:37Z">
+        <w:r>
+          <w:t xml:space="preserve"> = 35.45 g mol⁻¹.</w:t>
+        </w:r>
+      </w:ins>
+    </w:p>
     <w:p>
       <w:pPr>
         <w:pStyle w:val="Heading1"/>

</xml_diff>

<commit_message>
SI S1: units and conversions as a table
</commit_message>
<xml_diff>
--- a/deliver/Supplementary_tracked.docx
+++ b/deliver/Supplementary_tracked.docx
@@ -3559,15 +3559,15 @@
         <w:spacing w:after="120"/>
         <w:ind w:firstLine="0"/>
         <w:rPr>
-          <w:ins w:id="20024" w:author="Claude" w:date="2026-10-09T22:36:37Z"/>
+          <w:ins w:id="20006" w:author="Claude" w:date="2026-10-09T22:39:37Z"/>
         </w:rPr>
       </w:pPr>
-      <w:ins w:id="20001" w:author="Claude" w:date="2026-10-09T22:36:37Z">
+      <w:ins w:id="20001" w:author="Claude" w:date="2026-10-09T22:39:37Z">
         <w:r>
           <w:t xml:space="preserve">Interfacial balance and units. The interface couples O₂ consumption, Zn²⁺ release, OH⁻ generation and metal loss through the reaction above: for each mole of O₂ consumed by the Robin sink, two moles of Zn leave the metal and 2 mol Zn²⁺ and 4 mol OH⁻ are released, so the Zn source in the Zn equation equals ρ</w:t>
         </w:r>
       </w:ins>
-      <w:ins w:id="20002" w:author="Claude" w:date="2026-10-09T22:36:37Z">
+      <w:ins w:id="20002" w:author="Claude" w:date="2026-10-09T22:39:37Z">
         <w:r>
           <w:rPr>
             <w:vertAlign w:val="subscript"/>
@@ -3575,12 +3575,12 @@
           <w:t xml:space="preserve">Zn</w:t>
         </w:r>
       </w:ins>
-      <w:ins w:id="20003" w:author="Claude" w:date="2026-10-09T22:36:37Z">
+      <w:ins w:id="20003" w:author="Claude" w:date="2026-10-09T22:39:37Z">
         <w:r>
           <w:t xml:space="preserve">|v</w:t>
         </w:r>
       </w:ins>
-      <w:ins w:id="20004" w:author="Claude" w:date="2026-10-09T22:36:37Z">
+      <w:ins w:id="20004" w:author="Claude" w:date="2026-10-09T22:39:37Z">
         <w:r>
           <w:rPr>
             <w:vertAlign w:val="subscript"/>
@@ -3588,129 +3588,1245 @@
           <w:t xml:space="preserve">n</w:t>
         </w:r>
       </w:ins>
-      <w:ins w:id="20005" w:author="Claude" w:date="2026-10-09T22:36:37Z">
+      <w:ins w:id="20005" w:author="Claude" w:date="2026-10-09T22:39:37Z">
         <w:r>
-          <w:t xml:space="preserve">|. In the code, species fields are mass-based (g mm⁻³; OH⁻ in mol L⁻¹), with k</w:t>
-        </w:r>
-      </w:ins>
-      <w:ins w:id="20006" w:author="Claude" w:date="2026-10-09T22:36:37Z">
-        <w:r>
-          <w:rPr>
-            <w:vertAlign w:val="subscript"/>
-          </w:rPr>
-          <w:t xml:space="preserve">ORR</w:t>
-        </w:r>
-      </w:ins>
-      <w:ins w:id="20007" w:author="Claude" w:date="2026-10-09T22:36:37Z">
-        <w:r>
-          <w:t xml:space="preserve"> in mm h⁻¹, k</w:t>
-        </w:r>
-      </w:ins>
-      <w:ins w:id="20008" w:author="Claude" w:date="2026-10-09T22:36:37Z">
-        <w:r>
-          <w:rPr>
-            <w:vertAlign w:val="subscript"/>
-          </w:rPr>
-          <w:t xml:space="preserve">f</w:t>
-        </w:r>
-      </w:ins>
-      <w:ins w:id="20009" w:author="Claude" w:date="2026-10-09T22:36:37Z">
-        <w:r>
-          <w:t xml:space="preserve"> in h⁻¹, diffusivities in mm² h⁻¹ and k</w:t>
-        </w:r>
-      </w:ins>
-      <w:ins w:id="20010" w:author="Claude" w:date="2026-10-09T22:36:37Z">
-        <w:r>
-          <w:rPr>
-            <w:vertAlign w:val="subscript"/>
-          </w:rPr>
-          <w:t xml:space="preserve">d</w:t>
-        </w:r>
-      </w:ins>
-      <w:ins w:id="20011" w:author="Claude" w:date="2026-10-09T22:36:37Z">
-        <w:r>
-          <w:t xml:space="preserve"> in mm⁶ g⁻² h⁻¹; the molar k</w:t>
-        </w:r>
-      </w:ins>
-      <w:ins w:id="20012" w:author="Claude" w:date="2026-10-09T22:36:37Z">
-        <w:r>
-          <w:rPr>
-            <w:vertAlign w:val="subscript"/>
-          </w:rPr>
-          <w:t xml:space="preserve">d</w:t>
-        </w:r>
-      </w:ins>
-      <w:ins w:id="20013" w:author="Claude" w:date="2026-10-09T22:36:37Z">
-        <w:r>
-          <w:t xml:space="preserve"> of the Cl⁻ term (L² mol⁻² h⁻¹) equals k</w:t>
-        </w:r>
-      </w:ins>
-      <w:ins w:id="20014" w:author="Claude" w:date="2026-10-09T22:36:37Z">
-        <w:r>
-          <w:rPr>
-            <w:vertAlign w:val="subscript"/>
-          </w:rPr>
-          <w:t xml:space="preserve">d</w:t>
-        </w:r>
-      </w:ins>
-      <w:ins w:id="20015" w:author="Claude" w:date="2026-10-09T22:36:37Z">
-        <w:r>
-          <w:t xml:space="preserve"> (mm⁶ g⁻² h⁻¹) divided by (10⁶/M</w:t>
-        </w:r>
-      </w:ins>
-      <w:ins w:id="20016" w:author="Claude" w:date="2026-10-09T22:36:37Z">
-        <w:r>
-          <w:rPr>
-            <w:vertAlign w:val="subscript"/>
-          </w:rPr>
-          <w:t xml:space="preserve">Cl</w:t>
-        </w:r>
-      </w:ins>
-      <w:ins w:id="20017" w:author="Claude" w:date="2026-10-09T22:36:37Z">
-        <w:r>
-          <w:t xml:space="preserve">)² ≈ 8.0 × 10⁸. Concentrations in figures are given in mg L⁻¹; mmol L⁻¹ = (mg L⁻¹)/M, with M</w:t>
-        </w:r>
-      </w:ins>
-      <w:ins w:id="20018" w:author="Claude" w:date="2026-10-09T22:36:37Z">
-        <w:r>
-          <w:rPr>
-            <w:vertAlign w:val="subscript"/>
-          </w:rPr>
-          <w:t xml:space="preserve">Zn</w:t>
-        </w:r>
-      </w:ins>
-      <w:ins w:id="20019" w:author="Claude" w:date="2026-10-09T22:36:37Z">
-        <w:r>
-          <w:t xml:space="preserve"> = 65.38, M</w:t>
-        </w:r>
-      </w:ins>
-      <w:ins w:id="20020" w:author="Claude" w:date="2026-10-09T22:36:37Z">
-        <w:r>
-          <w:rPr>
-            <w:vertAlign w:val="subscript"/>
-          </w:rPr>
-          <w:t xml:space="preserve">O2</w:t>
-        </w:r>
-      </w:ins>
-      <w:ins w:id="20021" w:author="Claude" w:date="2026-10-09T22:36:37Z">
-        <w:r>
-          <w:t xml:space="preserve"> = 32.00 and M</w:t>
-        </w:r>
-      </w:ins>
-      <w:ins w:id="20022" w:author="Claude" w:date="2026-10-09T22:36:37Z">
-        <w:r>
-          <w:rPr>
-            <w:vertAlign w:val="subscript"/>
-          </w:rPr>
-          <w:t xml:space="preserve">Cl</w:t>
-        </w:r>
-      </w:ins>
-      <w:ins w:id="20023" w:author="Claude" w:date="2026-10-09T22:36:37Z">
-        <w:r>
-          <w:t xml:space="preserve"> = 35.45 g mol⁻¹.</w:t>
+          <w:t xml:space="preserve">|. The units used in the code and figures, and their conversions, are listed below.</w:t>
         </w:r>
       </w:ins>
     </w:p>
+    <w:tbl>
+      <w:tblPr>
+        <w:tblW w:w="9026" w:type="dxa"/>
+        <w:jc w:val="center"/>
+        <w:tblBorders>
+          <w:top w:val="single" w:sz="12" w:space="0" w:color="000000"/>
+          <w:bottom w:val="single" w:sz="12" w:space="0" w:color="000000"/>
+        </w:tblBorders>
+        <w:tblLayout w:type="fixed"/>
+        <w:tblCellMar>
+          <w:top w:w="30" w:type="dxa"/>
+          <w:left w:w="90" w:type="dxa"/>
+          <w:bottom w:w="30" w:type="dxa"/>
+          <w:right w:w="90" w:type="dxa"/>
+        </w:tblCellMar>
+        <w:tblLook w:val="04A0" w:firstRow="1" w:lastRow="0" w:firstColumn="1" w:lastColumn="0" w:noHBand="0" w:noVBand="1"/>
+      </w:tblPr>
+      <w:tblGrid>
+        <w:gridCol w:w="2500"/>
+        <w:gridCol w:w="2000"/>
+        <w:gridCol w:w="4526"/>
+      </w:tblGrid>
+      <w:tr>
+        <w:trPr>
+          <w:cantSplit/>
+          <w:jc w:val="center"/>
+          <w:ins w:id="20007" w:author="Claude" w:date="2026-10-09T22:39:37Z"/>
+        </w:trPr>
+        <w:tc>
+          <w:tcPr>
+            <w:tcW w:w="2500" w:type="dxa"/>
+            <w:vAlign w:val="center"/>
+          </w:tcPr>
+          <w:p>
+            <w:pPr>
+              <w:keepNext/>
+              <w:spacing w:before="20" w:after="20" w:line="240" w:lineRule="auto"/>
+              <w:ind w:firstLine="0"/>
+              <w:jc w:val="left"/>
+              <w:rPr>
+                <w:ins w:id="20014" w:author="Claude" w:date="2026-10-09T22:39:37Z"/>
+                <w:ins w:id="20009" w:author="Claude" w:date="2026-10-09T22:39:37Z"/>
+                <w:rFonts w:cs="Times New Roman"/>
+                <w:sz w:val="22"/>
+                <w:szCs w:val="22"/>
+                <w:lang w:eastAsia="en-US"/>
+              </w:rPr>
+            </w:pPr>
+            <w:ins w:id="20008" w:author="Claude" w:date="2026-10-09T22:39:37Z">
+              <w:r>
+                <w:rPr>
+                  <w:rFonts w:cs="Times New Roman"/>
+                  <w:sz w:val="20"/>
+                  <w:szCs w:val="20"/>
+                  <w:lang w:eastAsia="en-US"/>
+                </w:rPr>
+                <w:t>Quantity</w:t>
+              </w:r>
+            </w:ins>
+          </w:p>
+        </w:tc>
+        <w:tc>
+          <w:tcPr>
+            <w:tcW w:w="2000" w:type="dxa"/>
+            <w:vAlign w:val="center"/>
+          </w:tcPr>
+          <w:p>
+            <w:pPr>
+              <w:keepNext/>
+              <w:spacing w:before="20" w:after="20" w:line="240" w:lineRule="auto"/>
+              <w:ind w:firstLine="0"/>
+              <w:jc w:val="left"/>
+              <w:rPr>
+                <w:ins w:id="20015" w:author="Claude" w:date="2026-10-09T22:39:37Z"/>
+                <w:ins w:id="20011" w:author="Claude" w:date="2026-10-09T22:39:37Z"/>
+                <w:rFonts w:cs="Times New Roman"/>
+                <w:sz w:val="22"/>
+                <w:szCs w:val="22"/>
+                <w:lang w:eastAsia="en-US"/>
+              </w:rPr>
+            </w:pPr>
+            <w:ins w:id="20010" w:author="Claude" w:date="2026-10-09T22:39:37Z">
+              <w:r>
+                <w:rPr>
+                  <w:rFonts w:cs="Times New Roman"/>
+                  <w:sz w:val="20"/>
+                  <w:szCs w:val="20"/>
+                  <w:lang w:eastAsia="en-US"/>
+                </w:rPr>
+                <w:t>Unit in the code</w:t>
+              </w:r>
+            </w:ins>
+          </w:p>
+        </w:tc>
+        <w:tc>
+          <w:tcPr>
+            <w:tcW w:w="4526" w:type="dxa"/>
+            <w:vAlign w:val="center"/>
+          </w:tcPr>
+          <w:p>
+            <w:pPr>
+              <w:keepNext/>
+              <w:spacing w:before="20" w:after="20" w:line="240" w:lineRule="auto"/>
+              <w:ind w:firstLine="0"/>
+              <w:jc w:val="left"/>
+              <w:rPr>
+                <w:ins w:id="20016" w:author="Claude" w:date="2026-10-09T22:39:37Z"/>
+                <w:ins w:id="20013" w:author="Claude" w:date="2026-10-09T22:39:37Z"/>
+                <w:rFonts w:cs="Times New Roman"/>
+                <w:sz w:val="22"/>
+                <w:szCs w:val="22"/>
+                <w:lang w:eastAsia="en-US"/>
+              </w:rPr>
+            </w:pPr>
+            <w:ins w:id="20012" w:author="Claude" w:date="2026-10-09T22:39:37Z">
+              <w:r>
+                <w:rPr>
+                  <w:rFonts w:cs="Times New Roman"/>
+                  <w:sz w:val="20"/>
+                  <w:szCs w:val="20"/>
+                  <w:lang w:eastAsia="en-US"/>
+                </w:rPr>
+                <w:t>Conversion / note</w:t>
+              </w:r>
+            </w:ins>
+          </w:p>
+        </w:tc>
+      </w:tr>
+      <w:tr>
+        <w:trPr>
+          <w:cantSplit/>
+          <w:jc w:val="center"/>
+          <w:ins w:id="20017" w:author="Claude" w:date="2026-10-09T22:39:37Z"/>
+        </w:trPr>
+        <w:tc>
+          <w:tcPr>
+            <w:tcW w:w="2500" w:type="dxa"/>
+            <w:vAlign w:val="center"/>
+          </w:tcPr>
+          <w:p>
+            <w:pPr>
+              <w:keepNext/>
+              <w:spacing w:before="20" w:after="20" w:line="240" w:lineRule="auto"/>
+              <w:ind w:firstLine="0"/>
+              <w:jc w:val="left"/>
+              <w:rPr>
+                <w:ins w:id="20027" w:author="Claude" w:date="2026-10-09T22:39:37Z"/>
+                <w:ins w:id="20019" w:author="Claude" w:date="2026-10-09T22:39:37Z"/>
+                <w:rFonts w:cs="Times New Roman"/>
+                <w:sz w:val="22"/>
+                <w:szCs w:val="22"/>
+                <w:lang w:eastAsia="en-US"/>
+              </w:rPr>
+            </w:pPr>
+            <w:ins w:id="20018" w:author="Claude" w:date="2026-10-09T22:39:37Z">
+              <w:r>
+                <w:rPr>
+                  <w:rFonts w:cs="Times New Roman"/>
+                  <w:sz w:val="20"/>
+                  <w:szCs w:val="20"/>
+                  <w:lang w:eastAsia="en-US"/>
+                </w:rPr>
+                <w:t>Zn²⁺, Cl⁻, O₂ fields</w:t>
+              </w:r>
+            </w:ins>
+          </w:p>
+        </w:tc>
+        <w:tc>
+          <w:tcPr>
+            <w:tcW w:w="2000" w:type="dxa"/>
+            <w:vAlign w:val="center"/>
+          </w:tcPr>
+          <w:p>
+            <w:pPr>
+              <w:keepNext/>
+              <w:spacing w:before="20" w:after="20" w:line="240" w:lineRule="auto"/>
+              <w:ind w:firstLine="0"/>
+              <w:jc w:val="left"/>
+              <w:rPr>
+                <w:ins w:id="20028" w:author="Claude" w:date="2026-10-09T22:39:37Z"/>
+                <w:ins w:id="20021" w:author="Claude" w:date="2026-10-09T22:39:37Z"/>
+                <w:rFonts w:cs="Times New Roman"/>
+                <w:sz w:val="22"/>
+                <w:szCs w:val="22"/>
+                <w:lang w:eastAsia="en-US"/>
+              </w:rPr>
+            </w:pPr>
+            <w:ins w:id="20020" w:author="Claude" w:date="2026-10-09T22:39:37Z">
+              <w:r>
+                <w:rPr>
+                  <w:rFonts w:cs="Times New Roman"/>
+                  <w:sz w:val="20"/>
+                  <w:szCs w:val="20"/>
+                  <w:lang w:eastAsia="en-US"/>
+                </w:rPr>
+                <w:t>g mm⁻³</w:t>
+              </w:r>
+            </w:ins>
+          </w:p>
+        </w:tc>
+        <w:tc>
+          <w:tcPr>
+            <w:tcW w:w="4526" w:type="dxa"/>
+            <w:vAlign w:val="center"/>
+          </w:tcPr>
+          <w:p>
+            <w:pPr>
+              <w:keepNext/>
+              <w:spacing w:before="20" w:after="20" w:line="240" w:lineRule="auto"/>
+              <w:ind w:firstLine="0"/>
+              <w:jc w:val="left"/>
+              <w:rPr>
+                <w:ins w:id="20029" w:author="Claude" w:date="2026-10-09T22:39:37Z"/>
+                <w:ins w:id="20026" w:author="Claude" w:date="2026-10-09T22:39:37Z"/>
+                <w:rFonts w:cs="Times New Roman"/>
+                <w:sz w:val="22"/>
+                <w:szCs w:val="22"/>
+                <w:lang w:eastAsia="en-US"/>
+              </w:rPr>
+            </w:pPr>
+            <w:ins w:id="20022" w:author="Claude" w:date="2026-10-09T22:39:37Z">
+              <w:r>
+                <w:rPr>
+                  <w:rFonts w:cs="Times New Roman"/>
+                  <w:sz w:val="20"/>
+                  <w:szCs w:val="20"/>
+                  <w:lang w:eastAsia="en-US"/>
+                </w:rPr>
+                <w:t>mol mm⁻³ = (g mm⁻³) / M</w:t>
+              </w:r>
+            </w:ins>
+            <w:ins w:id="20023" w:author="Claude" w:date="2026-10-09T22:39:37Z">
+              <w:r>
+                <w:rPr>
+                  <w:rFonts w:cs="Times New Roman"/>
+                  <w:sz w:val="20"/>
+                  <w:szCs w:val="20"/>
+                  <w:vertAlign w:val="subscript"/>
+                  <w:lang w:eastAsia="en-US"/>
+                </w:rPr>
+              </w:r>
+            </w:ins>
+            <w:ins w:id="20024" w:author="Claude" w:date="2026-10-09T22:39:37Z">
+              <w:r>
+                <w:rPr>
+                  <w:rFonts w:cs="Times New Roman"/>
+                  <w:sz w:val="20"/>
+                  <w:szCs w:val="20"/>
+                  <w:lang w:eastAsia="en-US"/>
+                </w:rPr>
+              </w:r>
+            </w:ins>
+            <w:ins w:id="20025" w:author="Claude" w:date="2026-10-09T22:39:37Z">
+              <w:r>
+                <w:rPr>
+                  <w:rFonts w:cs="Times New Roman"/>
+                  <w:sz w:val="20"/>
+                  <w:szCs w:val="20"/>
+                  <w:vertAlign w:val="subscript"/>
+                  <w:lang w:eastAsia="en-US"/>
+                </w:rPr>
+              </w:r>
+            </w:ins>
+          </w:p>
+        </w:tc>
+      </w:tr>
+      <w:tr>
+        <w:trPr>
+          <w:cantSplit/>
+          <w:jc w:val="center"/>
+          <w:ins w:id="20030" w:author="Claude" w:date="2026-10-09T22:39:37Z"/>
+        </w:trPr>
+        <w:tc>
+          <w:tcPr>
+            <w:tcW w:w="2500" w:type="dxa"/>
+            <w:vAlign w:val="center"/>
+          </w:tcPr>
+          <w:p>
+            <w:pPr>
+              <w:keepNext/>
+              <w:spacing w:before="20" w:after="20" w:line="240" w:lineRule="auto"/>
+              <w:ind w:firstLine="0"/>
+              <w:jc w:val="left"/>
+              <w:rPr>
+                <w:ins w:id="20040" w:author="Claude" w:date="2026-10-09T22:39:37Z"/>
+                <w:ins w:id="20032" w:author="Claude" w:date="2026-10-09T22:39:37Z"/>
+                <w:rFonts w:cs="Times New Roman"/>
+                <w:sz w:val="22"/>
+                <w:szCs w:val="22"/>
+                <w:lang w:eastAsia="en-US"/>
+              </w:rPr>
+            </w:pPr>
+            <w:ins w:id="20031" w:author="Claude" w:date="2026-10-09T22:39:37Z">
+              <w:r>
+                <w:rPr>
+                  <w:rFonts w:cs="Times New Roman"/>
+                  <w:sz w:val="20"/>
+                  <w:szCs w:val="20"/>
+                  <w:lang w:eastAsia="en-US"/>
+                </w:rPr>
+                <w:t>OH⁻ field</w:t>
+              </w:r>
+            </w:ins>
+          </w:p>
+        </w:tc>
+        <w:tc>
+          <w:tcPr>
+            <w:tcW w:w="2000" w:type="dxa"/>
+            <w:vAlign w:val="center"/>
+          </w:tcPr>
+          <w:p>
+            <w:pPr>
+              <w:keepNext/>
+              <w:spacing w:before="20" w:after="20" w:line="240" w:lineRule="auto"/>
+              <w:ind w:firstLine="0"/>
+              <w:jc w:val="left"/>
+              <w:rPr>
+                <w:ins w:id="20041" w:author="Claude" w:date="2026-10-09T22:39:37Z"/>
+                <w:ins w:id="20034" w:author="Claude" w:date="2026-10-09T22:39:37Z"/>
+                <w:rFonts w:cs="Times New Roman"/>
+                <w:sz w:val="22"/>
+                <w:szCs w:val="22"/>
+                <w:lang w:eastAsia="en-US"/>
+              </w:rPr>
+            </w:pPr>
+            <w:ins w:id="20033" w:author="Claude" w:date="2026-10-09T22:39:37Z">
+              <w:r>
+                <w:rPr>
+                  <w:rFonts w:cs="Times New Roman"/>
+                  <w:sz w:val="20"/>
+                  <w:szCs w:val="20"/>
+                  <w:lang w:eastAsia="en-US"/>
+                </w:rPr>
+                <w:t>mol L⁻¹</w:t>
+              </w:r>
+            </w:ins>
+          </w:p>
+        </w:tc>
+        <w:tc>
+          <w:tcPr>
+            <w:tcW w:w="4526" w:type="dxa"/>
+            <w:vAlign w:val="center"/>
+          </w:tcPr>
+          <w:p>
+            <w:pPr>
+              <w:keepNext/>
+              <w:spacing w:before="20" w:after="20" w:line="240" w:lineRule="auto"/>
+              <w:ind w:firstLine="0"/>
+              <w:jc w:val="left"/>
+              <w:rPr>
+                <w:ins w:id="20042" w:author="Claude" w:date="2026-10-09T22:39:37Z"/>
+                <w:ins w:id="20039" w:author="Claude" w:date="2026-10-09T22:39:37Z"/>
+                <w:rFonts w:cs="Times New Roman"/>
+                <w:sz w:val="22"/>
+                <w:szCs w:val="22"/>
+                <w:lang w:eastAsia="en-US"/>
+              </w:rPr>
+            </w:pPr>
+            <w:ins w:id="20035" w:author="Claude" w:date="2026-10-09T22:39:37Z">
+              <w:r>
+                <w:rPr>
+                  <w:rFonts w:cs="Times New Roman"/>
+                  <w:sz w:val="20"/>
+                  <w:szCs w:val="20"/>
+                  <w:lang w:eastAsia="en-US"/>
+                </w:rPr>
+                <w:t>—</w:t>
+              </w:r>
+            </w:ins>
+            <w:ins w:id="20036" w:author="Claude" w:date="2026-10-09T22:39:37Z">
+              <w:r>
+                <w:rPr>
+                  <w:rFonts w:cs="Times New Roman"/>
+                  <w:sz w:val="20"/>
+                  <w:szCs w:val="20"/>
+                  <w:vertAlign w:val="subscript"/>
+                  <w:lang w:eastAsia="en-US"/>
+                </w:rPr>
+              </w:r>
+            </w:ins>
+            <w:ins w:id="20037" w:author="Claude" w:date="2026-10-09T22:39:37Z">
+              <w:r>
+                <w:rPr>
+                  <w:rFonts w:cs="Times New Roman"/>
+                  <w:sz w:val="20"/>
+                  <w:szCs w:val="20"/>
+                  <w:lang w:eastAsia="en-US"/>
+                </w:rPr>
+              </w:r>
+            </w:ins>
+            <w:ins w:id="20038" w:author="Claude" w:date="2026-10-09T22:39:37Z">
+              <w:r>
+                <w:rPr>
+                  <w:rFonts w:cs="Times New Roman"/>
+                  <w:sz w:val="20"/>
+                  <w:szCs w:val="20"/>
+                  <w:vertAlign w:val="subscript"/>
+                  <w:lang w:eastAsia="en-US"/>
+                </w:rPr>
+              </w:r>
+            </w:ins>
+          </w:p>
+        </w:tc>
+      </w:tr>
+      <w:tr>
+        <w:trPr>
+          <w:cantSplit/>
+          <w:jc w:val="center"/>
+          <w:ins w:id="20043" w:author="Claude" w:date="2026-10-09T22:39:37Z"/>
+        </w:trPr>
+        <w:tc>
+          <w:tcPr>
+            <w:tcW w:w="2500" w:type="dxa"/>
+            <w:vAlign w:val="center"/>
+          </w:tcPr>
+          <w:p>
+            <w:pPr>
+              <w:keepNext/>
+              <w:spacing w:before="20" w:after="20" w:line="240" w:lineRule="auto"/>
+              <w:ind w:firstLine="0"/>
+              <w:jc w:val="left"/>
+              <w:rPr>
+                <w:ins w:id="20053" w:author="Claude" w:date="2026-10-09T22:39:37Z"/>
+                <w:ins w:id="20045" w:author="Claude" w:date="2026-10-09T22:39:37Z"/>
+                <w:rFonts w:cs="Times New Roman"/>
+                <w:sz w:val="22"/>
+                <w:szCs w:val="22"/>
+                <w:lang w:eastAsia="en-US"/>
+              </w:rPr>
+            </w:pPr>
+            <w:ins w:id="20044" w:author="Claude" w:date="2026-10-09T22:39:37Z">
+              <w:r>
+                <w:rPr>
+                  <w:rFonts w:cs="Times New Roman"/>
+                  <w:sz w:val="20"/>
+                  <w:szCs w:val="20"/>
+                  <w:lang w:eastAsia="en-US"/>
+                </w:rPr>
+                <w:t>k_ORR</w:t>
+              </w:r>
+            </w:ins>
+          </w:p>
+        </w:tc>
+        <w:tc>
+          <w:tcPr>
+            <w:tcW w:w="2000" w:type="dxa"/>
+            <w:vAlign w:val="center"/>
+          </w:tcPr>
+          <w:p>
+            <w:pPr>
+              <w:keepNext/>
+              <w:spacing w:before="20" w:after="20" w:line="240" w:lineRule="auto"/>
+              <w:ind w:firstLine="0"/>
+              <w:jc w:val="left"/>
+              <w:rPr>
+                <w:ins w:id="20054" w:author="Claude" w:date="2026-10-09T22:39:37Z"/>
+                <w:ins w:id="20047" w:author="Claude" w:date="2026-10-09T22:39:37Z"/>
+                <w:rFonts w:cs="Times New Roman"/>
+                <w:sz w:val="22"/>
+                <w:szCs w:val="22"/>
+                <w:lang w:eastAsia="en-US"/>
+              </w:rPr>
+            </w:pPr>
+            <w:ins w:id="20046" w:author="Claude" w:date="2026-10-09T22:39:37Z">
+              <w:r>
+                <w:rPr>
+                  <w:rFonts w:cs="Times New Roman"/>
+                  <w:sz w:val="20"/>
+                  <w:szCs w:val="20"/>
+                  <w:lang w:eastAsia="en-US"/>
+                </w:rPr>
+                <w:t>mm h⁻¹</w:t>
+              </w:r>
+            </w:ins>
+          </w:p>
+        </w:tc>
+        <w:tc>
+          <w:tcPr>
+            <w:tcW w:w="4526" w:type="dxa"/>
+            <w:vAlign w:val="center"/>
+          </w:tcPr>
+          <w:p>
+            <w:pPr>
+              <w:keepNext/>
+              <w:spacing w:before="20" w:after="20" w:line="240" w:lineRule="auto"/>
+              <w:ind w:firstLine="0"/>
+              <w:jc w:val="left"/>
+              <w:rPr>
+                <w:ins w:id="20055" w:author="Claude" w:date="2026-10-09T22:39:37Z"/>
+                <w:ins w:id="20052" w:author="Claude" w:date="2026-10-09T22:39:37Z"/>
+                <w:rFonts w:cs="Times New Roman"/>
+                <w:sz w:val="22"/>
+                <w:szCs w:val="22"/>
+                <w:lang w:eastAsia="en-US"/>
+              </w:rPr>
+            </w:pPr>
+            <w:ins w:id="20048" w:author="Claude" w:date="2026-10-09T22:39:37Z">
+              <w:r>
+                <w:rPr>
+                  <w:rFonts w:cs="Times New Roman"/>
+                  <w:sz w:val="20"/>
+                  <w:szCs w:val="20"/>
+                  <w:lang w:eastAsia="en-US"/>
+                </w:rPr>
+                <w:t>—</w:t>
+              </w:r>
+            </w:ins>
+            <w:ins w:id="20049" w:author="Claude" w:date="2026-10-09T22:39:37Z">
+              <w:r>
+                <w:rPr>
+                  <w:rFonts w:cs="Times New Roman"/>
+                  <w:sz w:val="20"/>
+                  <w:szCs w:val="20"/>
+                  <w:vertAlign w:val="subscript"/>
+                  <w:lang w:eastAsia="en-US"/>
+                </w:rPr>
+              </w:r>
+            </w:ins>
+            <w:ins w:id="20050" w:author="Claude" w:date="2026-10-09T22:39:37Z">
+              <w:r>
+                <w:rPr>
+                  <w:rFonts w:cs="Times New Roman"/>
+                  <w:sz w:val="20"/>
+                  <w:szCs w:val="20"/>
+                  <w:lang w:eastAsia="en-US"/>
+                </w:rPr>
+              </w:r>
+            </w:ins>
+            <w:ins w:id="20051" w:author="Claude" w:date="2026-10-09T22:39:37Z">
+              <w:r>
+                <w:rPr>
+                  <w:rFonts w:cs="Times New Roman"/>
+                  <w:sz w:val="20"/>
+                  <w:szCs w:val="20"/>
+                  <w:vertAlign w:val="subscript"/>
+                  <w:lang w:eastAsia="en-US"/>
+                </w:rPr>
+              </w:r>
+            </w:ins>
+          </w:p>
+        </w:tc>
+      </w:tr>
+      <w:tr>
+        <w:trPr>
+          <w:cantSplit/>
+          <w:jc w:val="center"/>
+          <w:ins w:id="20056" w:author="Claude" w:date="2026-10-09T22:39:37Z"/>
+        </w:trPr>
+        <w:tc>
+          <w:tcPr>
+            <w:tcW w:w="2500" w:type="dxa"/>
+            <w:vAlign w:val="center"/>
+          </w:tcPr>
+          <w:p>
+            <w:pPr>
+              <w:keepNext/>
+              <w:spacing w:before="20" w:after="20" w:line="240" w:lineRule="auto"/>
+              <w:ind w:firstLine="0"/>
+              <w:jc w:val="left"/>
+              <w:rPr>
+                <w:ins w:id="20066" w:author="Claude" w:date="2026-10-09T22:39:37Z"/>
+                <w:ins w:id="20058" w:author="Claude" w:date="2026-10-09T22:39:37Z"/>
+                <w:rFonts w:cs="Times New Roman"/>
+                <w:sz w:val="22"/>
+                <w:szCs w:val="22"/>
+                <w:lang w:eastAsia="en-US"/>
+              </w:rPr>
+            </w:pPr>
+            <w:ins w:id="20057" w:author="Claude" w:date="2026-10-09T22:39:37Z">
+              <w:r>
+                <w:rPr>
+                  <w:rFonts w:cs="Times New Roman"/>
+                  <w:sz w:val="20"/>
+                  <w:szCs w:val="20"/>
+                  <w:lang w:eastAsia="en-US"/>
+                </w:rPr>
+                <w:t>k_f</w:t>
+              </w:r>
+            </w:ins>
+          </w:p>
+        </w:tc>
+        <w:tc>
+          <w:tcPr>
+            <w:tcW w:w="2000" w:type="dxa"/>
+            <w:vAlign w:val="center"/>
+          </w:tcPr>
+          <w:p>
+            <w:pPr>
+              <w:keepNext/>
+              <w:spacing w:before="20" w:after="20" w:line="240" w:lineRule="auto"/>
+              <w:ind w:firstLine="0"/>
+              <w:jc w:val="left"/>
+              <w:rPr>
+                <w:ins w:id="20067" w:author="Claude" w:date="2026-10-09T22:39:37Z"/>
+                <w:ins w:id="20060" w:author="Claude" w:date="2026-10-09T22:39:37Z"/>
+                <w:rFonts w:cs="Times New Roman"/>
+                <w:sz w:val="22"/>
+                <w:szCs w:val="22"/>
+                <w:lang w:eastAsia="en-US"/>
+              </w:rPr>
+            </w:pPr>
+            <w:ins w:id="20059" w:author="Claude" w:date="2026-10-09T22:39:37Z">
+              <w:r>
+                <w:rPr>
+                  <w:rFonts w:cs="Times New Roman"/>
+                  <w:sz w:val="20"/>
+                  <w:szCs w:val="20"/>
+                  <w:lang w:eastAsia="en-US"/>
+                </w:rPr>
+                <w:t>h⁻¹</w:t>
+              </w:r>
+            </w:ins>
+          </w:p>
+        </w:tc>
+        <w:tc>
+          <w:tcPr>
+            <w:tcW w:w="4526" w:type="dxa"/>
+            <w:vAlign w:val="center"/>
+          </w:tcPr>
+          <w:p>
+            <w:pPr>
+              <w:keepNext/>
+              <w:spacing w:before="20" w:after="20" w:line="240" w:lineRule="auto"/>
+              <w:ind w:firstLine="0"/>
+              <w:jc w:val="left"/>
+              <w:rPr>
+                <w:ins w:id="20068" w:author="Claude" w:date="2026-10-09T22:39:37Z"/>
+                <w:ins w:id="20065" w:author="Claude" w:date="2026-10-09T22:39:37Z"/>
+                <w:rFonts w:cs="Times New Roman"/>
+                <w:sz w:val="22"/>
+                <w:szCs w:val="22"/>
+                <w:lang w:eastAsia="en-US"/>
+              </w:rPr>
+            </w:pPr>
+            <w:ins w:id="20061" w:author="Claude" w:date="2026-10-09T22:39:37Z">
+              <w:r>
+                <w:rPr>
+                  <w:rFonts w:cs="Times New Roman"/>
+                  <w:sz w:val="20"/>
+                  <w:szCs w:val="20"/>
+                  <w:lang w:eastAsia="en-US"/>
+                </w:rPr>
+                <w:t>—</w:t>
+              </w:r>
+            </w:ins>
+            <w:ins w:id="20062" w:author="Claude" w:date="2026-10-09T22:39:37Z">
+              <w:r>
+                <w:rPr>
+                  <w:rFonts w:cs="Times New Roman"/>
+                  <w:sz w:val="20"/>
+                  <w:szCs w:val="20"/>
+                  <w:vertAlign w:val="subscript"/>
+                  <w:lang w:eastAsia="en-US"/>
+                </w:rPr>
+              </w:r>
+            </w:ins>
+            <w:ins w:id="20063" w:author="Claude" w:date="2026-10-09T22:39:37Z">
+              <w:r>
+                <w:rPr>
+                  <w:rFonts w:cs="Times New Roman"/>
+                  <w:sz w:val="20"/>
+                  <w:szCs w:val="20"/>
+                  <w:lang w:eastAsia="en-US"/>
+                </w:rPr>
+              </w:r>
+            </w:ins>
+            <w:ins w:id="20064" w:author="Claude" w:date="2026-10-09T22:39:37Z">
+              <w:r>
+                <w:rPr>
+                  <w:rFonts w:cs="Times New Roman"/>
+                  <w:sz w:val="20"/>
+                  <w:szCs w:val="20"/>
+                  <w:vertAlign w:val="subscript"/>
+                  <w:lang w:eastAsia="en-US"/>
+                </w:rPr>
+              </w:r>
+            </w:ins>
+          </w:p>
+        </w:tc>
+      </w:tr>
+      <w:tr>
+        <w:trPr>
+          <w:cantSplit/>
+          <w:jc w:val="center"/>
+          <w:ins w:id="20069" w:author="Claude" w:date="2026-10-09T22:39:37Z"/>
+        </w:trPr>
+        <w:tc>
+          <w:tcPr>
+            <w:tcW w:w="2500" w:type="dxa"/>
+            <w:vAlign w:val="center"/>
+          </w:tcPr>
+          <w:p>
+            <w:pPr>
+              <w:keepNext/>
+              <w:spacing w:before="20" w:after="20" w:line="240" w:lineRule="auto"/>
+              <w:ind w:firstLine="0"/>
+              <w:jc w:val="left"/>
+              <w:rPr>
+                <w:ins w:id="20079" w:author="Claude" w:date="2026-10-09T22:39:37Z"/>
+                <w:ins w:id="20071" w:author="Claude" w:date="2026-10-09T22:39:37Z"/>
+                <w:rFonts w:cs="Times New Roman"/>
+                <w:sz w:val="22"/>
+                <w:szCs w:val="22"/>
+                <w:lang w:eastAsia="en-US"/>
+              </w:rPr>
+            </w:pPr>
+            <w:ins w:id="20070" w:author="Claude" w:date="2026-10-09T22:39:37Z">
+              <w:r>
+                <w:rPr>
+                  <w:rFonts w:cs="Times New Roman"/>
+                  <w:sz w:val="20"/>
+                  <w:szCs w:val="20"/>
+                  <w:lang w:eastAsia="en-US"/>
+                </w:rPr>
+                <w:t>k_d</w:t>
+              </w:r>
+            </w:ins>
+          </w:p>
+        </w:tc>
+        <w:tc>
+          <w:tcPr>
+            <w:tcW w:w="2000" w:type="dxa"/>
+            <w:vAlign w:val="center"/>
+          </w:tcPr>
+          <w:p>
+            <w:pPr>
+              <w:keepNext/>
+              <w:spacing w:before="20" w:after="20" w:line="240" w:lineRule="auto"/>
+              <w:ind w:firstLine="0"/>
+              <w:jc w:val="left"/>
+              <w:rPr>
+                <w:ins w:id="20080" w:author="Claude" w:date="2026-10-09T22:39:37Z"/>
+                <w:ins w:id="20073" w:author="Claude" w:date="2026-10-09T22:39:37Z"/>
+                <w:rFonts w:cs="Times New Roman"/>
+                <w:sz w:val="22"/>
+                <w:szCs w:val="22"/>
+                <w:lang w:eastAsia="en-US"/>
+              </w:rPr>
+            </w:pPr>
+            <w:ins w:id="20072" w:author="Claude" w:date="2026-10-09T22:39:37Z">
+              <w:r>
+                <w:rPr>
+                  <w:rFonts w:cs="Times New Roman"/>
+                  <w:sz w:val="20"/>
+                  <w:szCs w:val="20"/>
+                  <w:lang w:eastAsia="en-US"/>
+                </w:rPr>
+                <w:t>mm⁶ g⁻² h⁻¹</w:t>
+              </w:r>
+            </w:ins>
+          </w:p>
+        </w:tc>
+        <w:tc>
+          <w:tcPr>
+            <w:tcW w:w="4526" w:type="dxa"/>
+            <w:vAlign w:val="center"/>
+          </w:tcPr>
+          <w:p>
+            <w:pPr>
+              <w:keepNext/>
+              <w:spacing w:before="20" w:after="20" w:line="240" w:lineRule="auto"/>
+              <w:ind w:firstLine="0"/>
+              <w:jc w:val="left"/>
+              <w:rPr>
+                <w:ins w:id="20081" w:author="Claude" w:date="2026-10-09T22:39:37Z"/>
+                <w:ins w:id="20078" w:author="Claude" w:date="2026-10-09T22:39:37Z"/>
+                <w:rFonts w:cs="Times New Roman"/>
+                <w:sz w:val="22"/>
+                <w:szCs w:val="22"/>
+                <w:lang w:eastAsia="en-US"/>
+              </w:rPr>
+            </w:pPr>
+            <w:ins w:id="20074" w:author="Claude" w:date="2026-10-09T22:39:37Z">
+              <w:r>
+                <w:rPr>
+                  <w:rFonts w:cs="Times New Roman"/>
+                  <w:sz w:val="20"/>
+                  <w:szCs w:val="20"/>
+                  <w:lang w:eastAsia="en-US"/>
+                </w:rPr>
+                <w:t>Molar k_d (L² mol⁻² h⁻¹) = k_d / (10⁶/M_Cl)², with (10⁶/M_Cl)² ≈ 8.0 × 10⁸</w:t>
+              </w:r>
+            </w:ins>
+            <w:ins w:id="20075" w:author="Claude" w:date="2026-10-09T22:39:37Z">
+              <w:r>
+                <w:rPr>
+                  <w:rFonts w:cs="Times New Roman"/>
+                  <w:sz w:val="20"/>
+                  <w:szCs w:val="20"/>
+                  <w:vertAlign w:val="subscript"/>
+                  <w:lang w:eastAsia="en-US"/>
+                </w:rPr>
+              </w:r>
+            </w:ins>
+            <w:ins w:id="20076" w:author="Claude" w:date="2026-10-09T22:39:37Z">
+              <w:r>
+                <w:rPr>
+                  <w:rFonts w:cs="Times New Roman"/>
+                  <w:sz w:val="20"/>
+                  <w:szCs w:val="20"/>
+                  <w:lang w:eastAsia="en-US"/>
+                </w:rPr>
+              </w:r>
+            </w:ins>
+            <w:ins w:id="20077" w:author="Claude" w:date="2026-10-09T22:39:37Z">
+              <w:r>
+                <w:rPr>
+                  <w:rFonts w:cs="Times New Roman"/>
+                  <w:sz w:val="20"/>
+                  <w:szCs w:val="20"/>
+                  <w:vertAlign w:val="subscript"/>
+                  <w:lang w:eastAsia="en-US"/>
+                </w:rPr>
+              </w:r>
+            </w:ins>
+          </w:p>
+        </w:tc>
+      </w:tr>
+      <w:tr>
+        <w:trPr>
+          <w:cantSplit/>
+          <w:jc w:val="center"/>
+          <w:ins w:id="20082" w:author="Claude" w:date="2026-10-09T22:39:37Z"/>
+        </w:trPr>
+        <w:tc>
+          <w:tcPr>
+            <w:tcW w:w="2500" w:type="dxa"/>
+            <w:vAlign w:val="center"/>
+          </w:tcPr>
+          <w:p>
+            <w:pPr>
+              <w:keepNext/>
+              <w:spacing w:before="20" w:after="20" w:line="240" w:lineRule="auto"/>
+              <w:ind w:firstLine="0"/>
+              <w:jc w:val="left"/>
+              <w:rPr>
+                <w:ins w:id="20092" w:author="Claude" w:date="2026-10-09T22:39:37Z"/>
+                <w:ins w:id="20084" w:author="Claude" w:date="2026-10-09T22:39:37Z"/>
+                <w:rFonts w:cs="Times New Roman"/>
+                <w:sz w:val="22"/>
+                <w:szCs w:val="22"/>
+                <w:lang w:eastAsia="en-US"/>
+              </w:rPr>
+            </w:pPr>
+            <w:ins w:id="20083" w:author="Claude" w:date="2026-10-09T22:39:37Z">
+              <w:r>
+                <w:rPr>
+                  <w:rFonts w:cs="Times New Roman"/>
+                  <w:sz w:val="20"/>
+                  <w:szCs w:val="20"/>
+                  <w:lang w:eastAsia="en-US"/>
+                </w:rPr>
+                <w:t>Diffusivities</w:t>
+              </w:r>
+            </w:ins>
+          </w:p>
+        </w:tc>
+        <w:tc>
+          <w:tcPr>
+            <w:tcW w:w="2000" w:type="dxa"/>
+            <w:vAlign w:val="center"/>
+          </w:tcPr>
+          <w:p>
+            <w:pPr>
+              <w:keepNext/>
+              <w:spacing w:before="20" w:after="20" w:line="240" w:lineRule="auto"/>
+              <w:ind w:firstLine="0"/>
+              <w:jc w:val="left"/>
+              <w:rPr>
+                <w:ins w:id="20093" w:author="Claude" w:date="2026-10-09T22:39:37Z"/>
+                <w:ins w:id="20086" w:author="Claude" w:date="2026-10-09T22:39:37Z"/>
+                <w:rFonts w:cs="Times New Roman"/>
+                <w:sz w:val="22"/>
+                <w:szCs w:val="22"/>
+                <w:lang w:eastAsia="en-US"/>
+              </w:rPr>
+            </w:pPr>
+            <w:ins w:id="20085" w:author="Claude" w:date="2026-10-09T22:39:37Z">
+              <w:r>
+                <w:rPr>
+                  <w:rFonts w:cs="Times New Roman"/>
+                  <w:sz w:val="20"/>
+                  <w:szCs w:val="20"/>
+                  <w:lang w:eastAsia="en-US"/>
+                </w:rPr>
+                <w:t>mm² h⁻¹</w:t>
+              </w:r>
+            </w:ins>
+          </w:p>
+        </w:tc>
+        <w:tc>
+          <w:tcPr>
+            <w:tcW w:w="4526" w:type="dxa"/>
+            <w:vAlign w:val="center"/>
+          </w:tcPr>
+          <w:p>
+            <w:pPr>
+              <w:keepNext/>
+              <w:spacing w:before="20" w:after="20" w:line="240" w:lineRule="auto"/>
+              <w:ind w:firstLine="0"/>
+              <w:jc w:val="left"/>
+              <w:rPr>
+                <w:ins w:id="20094" w:author="Claude" w:date="2026-10-09T22:39:37Z"/>
+                <w:ins w:id="20091" w:author="Claude" w:date="2026-10-09T22:39:37Z"/>
+                <w:rFonts w:cs="Times New Roman"/>
+                <w:sz w:val="22"/>
+                <w:szCs w:val="22"/>
+                <w:lang w:eastAsia="en-US"/>
+              </w:rPr>
+            </w:pPr>
+            <w:ins w:id="20087" w:author="Claude" w:date="2026-10-09T22:39:37Z">
+              <w:r>
+                <w:rPr>
+                  <w:rFonts w:cs="Times New Roman"/>
+                  <w:sz w:val="20"/>
+                  <w:szCs w:val="20"/>
+                  <w:lang w:eastAsia="en-US"/>
+                </w:rPr>
+                <w:t>1 mm² s⁻¹ = 3600 mm² h⁻¹</w:t>
+              </w:r>
+            </w:ins>
+            <w:ins w:id="20088" w:author="Claude" w:date="2026-10-09T22:39:37Z">
+              <w:r>
+                <w:rPr>
+                  <w:rFonts w:cs="Times New Roman"/>
+                  <w:sz w:val="20"/>
+                  <w:szCs w:val="20"/>
+                  <w:vertAlign w:val="subscript"/>
+                  <w:lang w:eastAsia="en-US"/>
+                </w:rPr>
+              </w:r>
+            </w:ins>
+            <w:ins w:id="20089" w:author="Claude" w:date="2026-10-09T22:39:37Z">
+              <w:r>
+                <w:rPr>
+                  <w:rFonts w:cs="Times New Roman"/>
+                  <w:sz w:val="20"/>
+                  <w:szCs w:val="20"/>
+                  <w:lang w:eastAsia="en-US"/>
+                </w:rPr>
+              </w:r>
+            </w:ins>
+            <w:ins w:id="20090" w:author="Claude" w:date="2026-10-09T22:39:37Z">
+              <w:r>
+                <w:rPr>
+                  <w:rFonts w:cs="Times New Roman"/>
+                  <w:sz w:val="20"/>
+                  <w:szCs w:val="20"/>
+                  <w:vertAlign w:val="subscript"/>
+                  <w:lang w:eastAsia="en-US"/>
+                </w:rPr>
+              </w:r>
+            </w:ins>
+          </w:p>
+        </w:tc>
+      </w:tr>
+      <w:tr>
+        <w:trPr>
+          <w:cantSplit/>
+          <w:jc w:val="center"/>
+          <w:ins w:id="20095" w:author="Claude" w:date="2026-10-09T22:39:37Z"/>
+        </w:trPr>
+        <w:tc>
+          <w:tcPr>
+            <w:tcW w:w="2500" w:type="dxa"/>
+            <w:vAlign w:val="center"/>
+          </w:tcPr>
+          <w:p>
+            <w:pPr>
+              <w:keepNext/>
+              <w:spacing w:before="20" w:after="20" w:line="240" w:lineRule="auto"/>
+              <w:ind w:firstLine="0"/>
+              <w:jc w:val="left"/>
+              <w:rPr>
+                <w:ins w:id="20105" w:author="Claude" w:date="2026-10-09T22:39:37Z"/>
+                <w:ins w:id="20097" w:author="Claude" w:date="2026-10-09T22:39:37Z"/>
+                <w:rFonts w:cs="Times New Roman"/>
+                <w:sz w:val="22"/>
+                <w:szCs w:val="22"/>
+                <w:lang w:eastAsia="en-US"/>
+              </w:rPr>
+            </w:pPr>
+            <w:ins w:id="20096" w:author="Claude" w:date="2026-10-09T22:39:37Z">
+              <w:r>
+                <w:rPr>
+                  <w:rFonts w:cs="Times New Roman"/>
+                  <w:sz w:val="20"/>
+                  <w:szCs w:val="20"/>
+                  <w:lang w:eastAsia="en-US"/>
+                </w:rPr>
+                <w:t>Concentrations in figures</w:t>
+              </w:r>
+            </w:ins>
+          </w:p>
+        </w:tc>
+        <w:tc>
+          <w:tcPr>
+            <w:tcW w:w="2000" w:type="dxa"/>
+            <w:vAlign w:val="center"/>
+          </w:tcPr>
+          <w:p>
+            <w:pPr>
+              <w:keepNext/>
+              <w:spacing w:before="20" w:after="20" w:line="240" w:lineRule="auto"/>
+              <w:ind w:firstLine="0"/>
+              <w:jc w:val="left"/>
+              <w:rPr>
+                <w:ins w:id="20106" w:author="Claude" w:date="2026-10-09T22:39:37Z"/>
+                <w:ins w:id="20099" w:author="Claude" w:date="2026-10-09T22:39:37Z"/>
+                <w:rFonts w:cs="Times New Roman"/>
+                <w:sz w:val="22"/>
+                <w:szCs w:val="22"/>
+                <w:lang w:eastAsia="en-US"/>
+              </w:rPr>
+            </w:pPr>
+            <w:ins w:id="20098" w:author="Claude" w:date="2026-10-09T22:39:37Z">
+              <w:r>
+                <w:rPr>
+                  <w:rFonts w:cs="Times New Roman"/>
+                  <w:sz w:val="20"/>
+                  <w:szCs w:val="20"/>
+                  <w:lang w:eastAsia="en-US"/>
+                </w:rPr>
+                <w:t>mg L⁻¹</w:t>
+              </w:r>
+            </w:ins>
+          </w:p>
+        </w:tc>
+        <w:tc>
+          <w:tcPr>
+            <w:tcW w:w="4526" w:type="dxa"/>
+            <w:vAlign w:val="center"/>
+          </w:tcPr>
+          <w:p>
+            <w:pPr>
+              <w:keepNext/>
+              <w:spacing w:before="20" w:after="20" w:line="240" w:lineRule="auto"/>
+              <w:ind w:firstLine="0"/>
+              <w:jc w:val="left"/>
+              <w:rPr>
+                <w:ins w:id="20107" w:author="Claude" w:date="2026-10-09T22:39:37Z"/>
+                <w:ins w:id="20104" w:author="Claude" w:date="2026-10-09T22:39:37Z"/>
+                <w:rFonts w:cs="Times New Roman"/>
+                <w:sz w:val="22"/>
+                <w:szCs w:val="22"/>
+                <w:lang w:eastAsia="en-US"/>
+              </w:rPr>
+            </w:pPr>
+            <w:ins w:id="20100" w:author="Claude" w:date="2026-10-09T22:39:37Z">
+              <w:r>
+                <w:rPr>
+                  <w:rFonts w:cs="Times New Roman"/>
+                  <w:sz w:val="20"/>
+                  <w:szCs w:val="20"/>
+                  <w:lang w:eastAsia="en-US"/>
+                </w:rPr>
+                <w:t>mmol L⁻¹ = (mg L⁻¹) / M</w:t>
+              </w:r>
+            </w:ins>
+            <w:ins w:id="20101" w:author="Claude" w:date="2026-10-09T22:39:37Z">
+              <w:r>
+                <w:rPr>
+                  <w:rFonts w:cs="Times New Roman"/>
+                  <w:sz w:val="20"/>
+                  <w:szCs w:val="20"/>
+                  <w:vertAlign w:val="subscript"/>
+                  <w:lang w:eastAsia="en-US"/>
+                </w:rPr>
+              </w:r>
+            </w:ins>
+            <w:ins w:id="20102" w:author="Claude" w:date="2026-10-09T22:39:37Z">
+              <w:r>
+                <w:rPr>
+                  <w:rFonts w:cs="Times New Roman"/>
+                  <w:sz w:val="20"/>
+                  <w:szCs w:val="20"/>
+                  <w:lang w:eastAsia="en-US"/>
+                </w:rPr>
+              </w:r>
+            </w:ins>
+            <w:ins w:id="20103" w:author="Claude" w:date="2026-10-09T22:39:37Z">
+              <w:r>
+                <w:rPr>
+                  <w:rFonts w:cs="Times New Roman"/>
+                  <w:sz w:val="20"/>
+                  <w:szCs w:val="20"/>
+                  <w:vertAlign w:val="subscript"/>
+                  <w:lang w:eastAsia="en-US"/>
+                </w:rPr>
+              </w:r>
+            </w:ins>
+          </w:p>
+        </w:tc>
+      </w:tr>
+      <w:tr>
+        <w:trPr>
+          <w:cantSplit/>
+          <w:jc w:val="center"/>
+          <w:ins w:id="20108" w:author="Claude" w:date="2026-10-09T22:39:37Z"/>
+        </w:trPr>
+        <w:tc>
+          <w:tcPr>
+            <w:tcW w:w="2500" w:type="dxa"/>
+            <w:vAlign w:val="center"/>
+          </w:tcPr>
+          <w:p>
+            <w:pPr>
+              <w:keepNext/>
+              <w:spacing w:before="20" w:after="20" w:line="240" w:lineRule="auto"/>
+              <w:ind w:firstLine="0"/>
+              <w:jc w:val="left"/>
+              <w:rPr>
+                <w:ins w:id="20118" w:author="Claude" w:date="2026-10-09T22:39:37Z"/>
+                <w:ins w:id="20110" w:author="Claude" w:date="2026-10-09T22:39:37Z"/>
+                <w:rFonts w:cs="Times New Roman"/>
+                <w:sz w:val="22"/>
+                <w:szCs w:val="22"/>
+                <w:lang w:eastAsia="en-US"/>
+              </w:rPr>
+            </w:pPr>
+            <w:ins w:id="20109" w:author="Claude" w:date="2026-10-09T22:39:37Z">
+              <w:r>
+                <w:rPr>
+                  <w:rFonts w:cs="Times New Roman"/>
+                  <w:sz w:val="20"/>
+                  <w:szCs w:val="20"/>
+                  <w:lang w:eastAsia="en-US"/>
+                </w:rPr>
+                <w:t>Molar masses</w:t>
+              </w:r>
+            </w:ins>
+          </w:p>
+        </w:tc>
+        <w:tc>
+          <w:tcPr>
+            <w:tcW w:w="2000" w:type="dxa"/>
+            <w:vAlign w:val="center"/>
+          </w:tcPr>
+          <w:p>
+            <w:pPr>
+              <w:keepNext/>
+              <w:spacing w:before="20" w:after="20" w:line="240" w:lineRule="auto"/>
+              <w:ind w:firstLine="0"/>
+              <w:jc w:val="left"/>
+              <w:rPr>
+                <w:ins w:id="20119" w:author="Claude" w:date="2026-10-09T22:39:37Z"/>
+                <w:ins w:id="20112" w:author="Claude" w:date="2026-10-09T22:39:37Z"/>
+                <w:rFonts w:cs="Times New Roman"/>
+                <w:sz w:val="22"/>
+                <w:szCs w:val="22"/>
+                <w:lang w:eastAsia="en-US"/>
+              </w:rPr>
+            </w:pPr>
+            <w:ins w:id="20111" w:author="Claude" w:date="2026-10-09T22:39:37Z">
+              <w:r>
+                <w:rPr>
+                  <w:rFonts w:cs="Times New Roman"/>
+                  <w:sz w:val="20"/>
+                  <w:szCs w:val="20"/>
+                  <w:lang w:eastAsia="en-US"/>
+                </w:rPr>
+                <w:t>g mol⁻¹</w:t>
+              </w:r>
+            </w:ins>
+          </w:p>
+        </w:tc>
+        <w:tc>
+          <w:tcPr>
+            <w:tcW w:w="4526" w:type="dxa"/>
+            <w:vAlign w:val="center"/>
+          </w:tcPr>
+          <w:p>
+            <w:pPr>
+              <w:keepNext/>
+              <w:spacing w:before="20" w:after="20" w:line="240" w:lineRule="auto"/>
+              <w:ind w:firstLine="0"/>
+              <w:jc w:val="left"/>
+              <w:rPr>
+                <w:ins w:id="20120" w:author="Claude" w:date="2026-10-09T22:39:37Z"/>
+                <w:ins w:id="20117" w:author="Claude" w:date="2026-10-09T22:39:37Z"/>
+                <w:rFonts w:cs="Times New Roman"/>
+                <w:sz w:val="22"/>
+                <w:szCs w:val="22"/>
+                <w:lang w:eastAsia="en-US"/>
+              </w:rPr>
+            </w:pPr>
+            <w:ins w:id="20113" w:author="Claude" w:date="2026-10-09T22:39:37Z">
+              <w:r>
+                <w:rPr>
+                  <w:rFonts w:cs="Times New Roman"/>
+                  <w:sz w:val="20"/>
+                  <w:szCs w:val="20"/>
+                  <w:lang w:eastAsia="en-US"/>
+                </w:rPr>
+                <w:t>M_Zn = 65.38; M_O₂ = 32.00; M_Cl = 35.45</w:t>
+              </w:r>
+            </w:ins>
+            <w:ins w:id="20114" w:author="Claude" w:date="2026-10-09T22:39:37Z">
+              <w:r>
+                <w:rPr>
+                  <w:rFonts w:cs="Times New Roman"/>
+                  <w:sz w:val="20"/>
+                  <w:szCs w:val="20"/>
+                  <w:vertAlign w:val="subscript"/>
+                  <w:lang w:eastAsia="en-US"/>
+                </w:rPr>
+              </w:r>
+            </w:ins>
+            <w:ins w:id="20115" w:author="Claude" w:date="2026-10-09T22:39:37Z">
+              <w:r>
+                <w:rPr>
+                  <w:rFonts w:cs="Times New Roman"/>
+                  <w:sz w:val="20"/>
+                  <w:szCs w:val="20"/>
+                  <w:lang w:eastAsia="en-US"/>
+                </w:rPr>
+              </w:r>
+            </w:ins>
+            <w:ins w:id="20116" w:author="Claude" w:date="2026-10-09T22:39:37Z">
+              <w:r>
+                <w:rPr>
+                  <w:rFonts w:cs="Times New Roman"/>
+                  <w:sz w:val="20"/>
+                  <w:szCs w:val="20"/>
+                  <w:vertAlign w:val="subscript"/>
+                  <w:lang w:eastAsia="en-US"/>
+                </w:rPr>
+              </w:r>
+            </w:ins>
+          </w:p>
+        </w:tc>
+      </w:tr>
+    </w:tbl>
     <w:p>
       <w:pPr>
         <w:pStyle w:val="Heading1"/>

</xml_diff>